<commit_message>
add image with marked rectangels
</commit_message>
<xml_diff>
--- a/מה יש עוד לעשות.docx
+++ b/מה יש עוד לעשות.docx
@@ -295,6 +295,35 @@
           <w:rtl/>
         </w:rPr>
         <w:t xml:space="preserve">. </w:t>
+      </w:r>
+    </w:p>
+    <w:p>
+      <w:pPr>
+        <w:pStyle w:val="a3"/>
+        <w:numPr>
+          <w:ilvl w:val="0"/>
+          <w:numId w:val="2"/>
+        </w:numPr>
+      </w:pPr>
+      <w:r>
+        <w:rPr>
+          <w:rFonts w:hint="cs"/>
+          <w:rtl/>
+        </w:rPr>
+        <w:t xml:space="preserve">לשמור תמונה נוספת של כל מה שהצלחתי לזהות </w:t>
+      </w:r>
+      <w:r>
+        <w:rPr>
+          <w:rtl/>
+        </w:rPr>
+        <w:t>–</w:t>
+      </w:r>
+      <w:r>
+        <w:rPr>
+          <w:rFonts w:hint="cs"/>
+          <w:rtl/>
+        </w:rPr>
+        <w:t xml:space="preserve"> עם ריבועים על זה.</w:t>
       </w:r>
       <w:bookmarkStart w:id="0" w:name="_GoBack"/>
       <w:bookmarkEnd w:id="0"/>

</xml_diff>